<commit_message>
fix: sell frame-only items until lens pricing exists
Product page and checkout no longer offer lens upgrades or a prescription
file input that went nowhere. Checkout rejects any lens option other than
"Frame only" before reserving stock, and old carts are merged to frame-only.

Co-Authored-By: Claude Opus 5.5 <noreply@anthropic.com>
</commit_message>
<xml_diff>
--- a/docs/Bongkey_Technical_Learning_Guide.docx
+++ b/docs/Bongkey_Technical_Learning_Guide.docx
@@ -13245,6 +13245,90 @@
         <w:t>শেষ লক্ষ্য: code line মুখস্থ নয়। একটি request কোথা থেকে আসে, কোন boundary কী দায়িত্ব নেয়, database-এ কী বদলায়, failure কীভাবে safe থাকে এবং কোন evidence claim-টি support করে—এই গল্প পরিষ্কারভাবে বলতে পারা।</w:t>
       </w:r>
     </w:p>
+    <w:p>
+      <w:pPr>
+        <w:pStyle w:val="Heading1"/>
+        <w:keepNext/>
+      </w:pPr>
+      <w:r>
+        <w:t xml:space="preserve">15 Audit fix log — প্রতিটি fix থেকে শেখা</w:t>
+      </w:r>
+    </w:p>
+    <w:p>
+      <w:r>
+        <w:t xml:space="preserve">এই chapter-এ প্রতিটি audit fix-এর পরে একটি ছোট lesson যোগ হয়: সমস্যা, request flow, failure path, test এবং নিজে explain করার প্রশ্ন। বিস্তারিত code trace docs/BACKEND_FLOW_AND_ARCHITECTURE.md-এর section ৫-এ আছে।</w:t>
+      </w:r>
+    </w:p>
+    <w:p>
+      <w:pPr>
+        <w:pStyle w:val="Heading2"/>
+        <w:keepNext/>
+      </w:pPr>
+      <w:r>
+        <w:t xml:space="preserve">Fix 1: Frame-only checkout (lens option বন্ধ)</w:t>
+      </w:r>
+    </w:p>
+    <w:p>
+      <w:r>
+        <w:t xml:space="preserve">সমস্যা: Product page-এ lens বাছা যেত, কিন্তু backend কোনো lens price যোগ করত না। ফলে customer frame-এর দামে lens order দিতে পারত।</w:t>
+      </w:r>
+    </w:p>
+    <w:p>
+      <w:pPr>
+        <w:pStyle w:val="ListBullet"/>
+      </w:pPr>
+      <w:r>
+        <w:t xml:space="preserve">Concept: Trust boundary। Browser থেকে আসা যেকোনো মান (lens_option) attacker বদলাতে পারে, তাই backend নিজে allowed মান enforce করে।</w:t>
+      </w:r>
+    </w:p>
+    <w:p>
+      <w:pPr>
+        <w:pStyle w:val="ListBullet"/>
+      </w:pPr>
+      <w:r>
+        <w:t xml:space="preserve">Code: orders.CheckoutService.Place প্রথম validation loop-এ LensOption খালি বা "Frame only" না হলে ErrInvalidCheckout দেয়।</w:t>
+      </w:r>
+    </w:p>
+    <w:p>
+      <w:pPr>
+        <w:pStyle w:val="ListBullet"/>
+      </w:pPr>
+      <w:r>
+        <w:t xml:space="preserve">Success: addItem(product) → POST /api/orders (lens_option "Frame only") → Place → transaction → InsertItem → 200।</w:t>
+      </w:r>
+    </w:p>
+    <w:p>
+      <w:pPr>
+        <w:pStyle w:val="ListBullet"/>
+      </w:pPr>
+      <w:r>
+        <w:t xml:space="preserve">Failure: সরাসরি API-তে "Prescription lens" পাঠালে transaction শুরুর আগেই 400; stock অপরিবর্তিত।</w:t>
+      </w:r>
+    </w:p>
+    <w:p>
+      <w:pPr>
+        <w:pStyle w:val="ListBullet"/>
+      </w:pPr>
+      <w:r>
+        <w:t xml:space="preserve">কেন service-এ: দাম ও বিক্রয়যোগ্যতা business rule; handler শুধু parse করে, middleware-এ business rule রাখা নিষেধ।</w:t>
+      </w:r>
+    </w:p>
+    <w:p>
+      <w:pPr>
+        <w:pStyle w:val="ListBullet"/>
+      </w:pPr>
+      <w:r>
+        <w:t xml:space="preserve">Test: TestCheckoutRejectsUnpricedLensOption (negative + positive case)।</w:t>
+      </w:r>
+    </w:p>
+    <w:p>
+      <w:pPr>
+        <w:pStyle w:val="ListBullet"/>
+      </w:pPr>
+      <w:r>
+        <w:t xml:space="preserve">Explain-back: frontend থেকে option লুকানো কেন যথেষ্ট নয়? কোন layer final সিদ্ধান্ত নেয়?</w:t>
+      </w:r>
+    </w:p>
     <w:sectPr>
       <w:headerReference w:type="default" r:id="rId9"/>
       <w:footerReference w:type="default" r:id="rId10"/>

</xml_diff>

<commit_message>
fix: show order items to the owner and the guest
Order detail responses now include the item snapshot saved at checkout.
The admin orders page loads it on demand, and the order success page lists it.

Co-Authored-By: Claude Opus 5.5 <noreply@anthropic.com>
</commit_message>
<xml_diff>
--- a/docs/Bongkey_Technical_Learning_Guide.docx
+++ b/docs/Bongkey_Technical_Learning_Guide.docx
@@ -13329,6 +13329,76 @@
         <w:t xml:space="preserve">Explain-back: frontend থেকে option লুকানো কেন যথেষ্ট নয়? কোন layer final সিদ্ধান্ত নেয়?</w:t>
       </w:r>
     </w:p>
+    <w:p>
+      <w:pPr>
+        <w:pStyle w:val="Heading2"/>
+        <w:keepNext/>
+      </w:pPr>
+      <w:r>
+        <w:t xml:space="preserve">Fix 2: Order-এর item দেখা (admin ও guest)</w:t>
+      </w:r>
+    </w:p>
+    <w:p>
+      <w:r>
+        <w:t xml:space="preserve">সমস্যা: Order API কোনো item ফেরত দিত না, তাই owner জানতেন না কী pack করবেন।</w:t>
+      </w:r>
+    </w:p>
+    <w:p>
+      <w:pPr>
+        <w:pStyle w:val="ListBullet"/>
+      </w:pPr>
+      <w:r>
+        <w:t xml:space="preserve">Concept: Snapshot data। order_items-এ checkout সময়ের নাম ও দাম থাকে; পরে product বদলালেও পুরনো order একই থাকে।</w:t>
+      </w:r>
+    </w:p>
+    <w:p>
+      <w:pPr>
+        <w:pStyle w:val="ListBullet"/>
+      </w:pPr>
+      <w:r>
+        <w:t xml:space="preserve">Code: PostgresReader.Find → items(ctx, orderID) → Summary.Items → respondWithOrder JSON "items"।</w:t>
+      </w:r>
+    </w:p>
+    <w:p>
+      <w:pPr>
+        <w:pStyle w:val="ListBullet"/>
+      </w:pPr>
+      <w:r>
+        <w:t xml:space="preserve">Success: View items → GET /api/admin/orders/:id → AdminAuth c.Next() → GetAdminOrder → AccessService.Admin → Find → 200।</w:t>
+      </w:r>
+    </w:p>
+    <w:p>
+      <w:pPr>
+        <w:pStyle w:val="ListBullet"/>
+      </w:pPr>
+      <w:r>
+        <w:t xml:space="preserve">Failure: token নেই → AdminAuth AbortWithStatusJSON(401) এবং return; handler চলে না। ভুল guest token → 404, কোনো private data নেই।</w:t>
+      </w:r>
+    </w:p>
+    <w:p>
+      <w:pPr>
+        <w:pStyle w:val="ListBullet"/>
+      </w:pPr>
+      <w:r>
+        <w:t xml:space="preserve">Go শেখা: rows.Next() loop, defer rows.Close(), শেষে rows.Err() check — না করলে connection leak বা অর্ধেক data।</w:t>
+      </w:r>
+    </w:p>
+    <w:p>
+      <w:pPr>
+        <w:pStyle w:val="ListBullet"/>
+      </w:pPr>
+      <w:r>
+        <w:t xml:space="preserve">Test: TestGuestOrderResponse item name-ও private data হিসেবে যাচাই করে।</w:t>
+      </w:r>
+    </w:p>
+    <w:p>
+      <w:pPr>
+        <w:pStyle w:val="ListBullet"/>
+      </w:pPr>
+      <w:r>
+        <w:t xml:space="preserve">Explain-back: Middleware reject করা আর handler error দেওয়ার মধ্যে পার্থক্য কী?</w:t>
+      </w:r>
+    </w:p>
     <w:sectPr>
       <w:headerReference w:type="default" r:id="rId9"/>
       <w:footerReference w:type="default" r:id="rId10"/>

</xml_diff>

<commit_message>
fix: rate-limit admin login and hide owner email timing
Each client IP gets ten login attempts per 15 minutes, counted atomically in
PostgreSQL so all instances share one budget. Unknown emails run a dummy
bcrypt compare, and the login body is capped at 4KB.

Co-Authored-By: Claude Opus 5.5 <noreply@anthropic.com>
</commit_message>
<xml_diff>
--- a/docs/Bongkey_Technical_Learning_Guide.docx
+++ b/docs/Bongkey_Technical_Learning_Guide.docx
@@ -13399,6 +13399,84 @@
         <w:t xml:space="preserve">Explain-back: Middleware reject করা আর handler error দেওয়ার মধ্যে পার্থক্য কী?</w:t>
       </w:r>
     </w:p>
+    <w:p>
+      <w:pPr>
+        <w:pStyle w:val="Heading2"/>
+        <w:keepNext/>
+      </w:pPr>
+      <w:r>
+        <w:t xml:space="preserve">Fix 3: Admin login rate limit</w:t>
+      </w:r>
+    </w:p>
+    <w:p>
+      <w:r>
+        <w:t xml:space="preserve">সমস্যা: Login endpoint অসীম password guess নিত, আর ভুল email-এ দ্রুত উত্তর দিয়ে owner email ফাঁস করত।</w:t>
+      </w:r>
+    </w:p>
+    <w:p>
+      <w:pPr>
+        <w:pStyle w:val="ListBullet"/>
+      </w:pPr>
+      <w:r>
+        <w:t xml:space="preserve">Concept: Rate limiting ও timing side-channel। Attacker সময় মেপে বুঝতে পারে কোন email আছে, তাই দুই পথেই একই bcrypt কাজ করানো হয়।</w:t>
+      </w:r>
+    </w:p>
+    <w:p>
+      <w:pPr>
+        <w:pStyle w:val="ListBullet"/>
+      </w:pPr>
+      <w:r>
+        <w:t xml:space="preserve">Code: auth.Service.Login → Limiter.Count (PostgreSQL upsert) → ১০-এর বেশি হলে ErrLoginLimited → handler 429।</w:t>
+      </w:r>
+    </w:p>
+    <w:p>
+      <w:pPr>
+        <w:pStyle w:val="ListBullet"/>
+      </w:pPr>
+      <w:r>
+        <w:t xml:space="preserve">Concurrency: "check then write" দুই query-তে করলে দুই request একসাথে check পাস করতে পারত। একটিমাত্র INSERT ... ON CONFLICT DO UPDATE ... RETURNING atomic।</w:t>
+      </w:r>
+    </w:p>
+    <w:p>
+      <w:pPr>
+        <w:pStyle w:val="ListBullet"/>
+      </w:pPr>
+      <w:r>
+        <w:t xml:space="preserve">কেন mutex নয়: mutex শুধু এক process-এর memory রক্ষা করে; একাধিক server instance-এ কাজ করে না।</w:t>
+      </w:r>
+    </w:p>
+    <w:p>
+      <w:pPr>
+        <w:pStyle w:val="ListBullet"/>
+      </w:pPr>
+      <w:r>
+        <w:t xml:space="preserve">Failure: Limiter না থাকলে service error দেয় (fail closed) — security config ভুল হলে খোলা দরজা নয়, বন্ধ দরজা।</w:t>
+      </w:r>
+    </w:p>
+    <w:p>
+      <w:pPr>
+        <w:pStyle w:val="ListBullet"/>
+      </w:pPr>
+      <w:r>
+        <w:t xml:space="preserve">Test: TestLoginRateLimitStopsPasswordGuessing (unit) এবং TestPostgresLoginLimiterCountsConcurrentAttempts (আসল PostgreSQL, ১০ goroutine)।</w:t>
+      </w:r>
+    </w:p>
+    <w:p>
+      <w:pPr>
+        <w:pStyle w:val="ListBullet"/>
+      </w:pPr>
+      <w:r>
+        <w:t xml:space="preserve">Go শেখা: sync.WaitGroup দিয়ে goroutine-এর শেষ অপেক্ষা, buffered error channel, sync.OnceValue দিয়ে একবার হিসাব।</w:t>
+      </w:r>
+    </w:p>
+    <w:p>
+      <w:pPr>
+        <w:pStyle w:val="ListBullet"/>
+      </w:pPr>
+      <w:r>
+        <w:t xml:space="preserve">Explain-back: 401 আর 429-এর পার্থক্য কী, আর কোনটা কোন layer থেকে আসে?</w:t>
+      </w:r>
+    </w:p>
     <w:sectPr>
       <w:headerReference w:type="default" r:id="rId9"/>
       <w:footerReference w:type="default" r:id="rId10"/>

</xml_diff>

<commit_message>
fix: confirm live prices at checkout and survive a corrupt cart
Checkout reloads the catalog after the saved cart loads, updates changed
prices, drops unavailable items, and keeps Place Order disabled until prices
are confirmed. Cart loading tolerates corrupt or blocked storage.

Co-Authored-By: Claude Opus 5.5 <noreply@anthropic.com>
</commit_message>
<xml_diff>
--- a/docs/Bongkey_Technical_Learning_Guide.docx
+++ b/docs/Bongkey_Technical_Learning_Guide.docx
@@ -13477,6 +13477,76 @@
         <w:t xml:space="preserve">Explain-back: 401 আর 429-এর পার্থক্য কী, আর কোনটা কোন layer থেকে আসে?</w:t>
       </w:r>
     </w:p>
+    <w:p>
+      <w:pPr>
+        <w:pStyle w:val="Heading2"/>
+        <w:keepNext/>
+      </w:pPr>
+      <w:r>
+        <w:t xml:space="preserve">Fix 4 ও 5: Checkout-এ বর্তমান দাম ও নিরাপদ cart load</w:t>
+      </w:r>
+    </w:p>
+    <w:p>
+      <w:r>
+        <w:t xml:space="preserve">সমস্যা: Cart-এ রাখা পুরনো দাম checkout-এ দেখাত, আর ভাঙা localStorage data পুরো site crash করত।</w:t>
+      </w:r>
+    </w:p>
+    <w:p>
+      <w:pPr>
+        <w:pStyle w:val="ListBullet"/>
+      </w:pPr>
+      <w:r>
+        <w:t xml:space="preserve">Concept: Client state বনাম server state। Cart-এর product copy শুধু cache; দাম আর stock-এর authoritative উৎস backend।</w:t>
+      </w:r>
+    </w:p>
+    <w:p>
+      <w:pPr>
+        <w:pStyle w:val="ListBullet"/>
+      </w:pPr>
+      <w:r>
+        <w:t xml:space="preserve">Code: CartProvider loadSavedItems (try/catch) → ready → CheckoutPage checkCurrentPrices → fetchProducts → refreshProducts।</w:t>
+      </w:r>
+    </w:p>
+    <w:p>
+      <w:pPr>
+        <w:pStyle w:val="ListBullet"/>
+      </w:pPr>
+      <w:r>
+        <w:t xml:space="preserve">Success: GET /api/products থেকে নতুন দাম এনে cart ঠিক করা; পরিবর্তন হলে customer-কে notice।</w:t>
+      </w:r>
+    </w:p>
+    <w:p>
+      <w:pPr>
+        <w:pStyle w:val="ListBullet"/>
+      </w:pPr>
+      <w:r>
+        <w:t xml:space="preserve">Failure: catalog API fail করলে submit বন্ধ আর "Try again"; ভাঙা storage data হলে cart খালি থেকে শুরু, site চলতে থাকে।</w:t>
+      </w:r>
+    </w:p>
+    <w:p>
+      <w:pPr>
+        <w:pStyle w:val="ListBullet"/>
+      </w:pPr>
+      <w:r>
+        <w:t xml:space="preserve">React শেখা: child component-এর useEffect parent-এর আগে চলে, তাই "ready" flag দিয়ে অপেক্ষা।</w:t>
+      </w:r>
+    </w:p>
+    <w:p>
+      <w:pPr>
+        <w:pStyle w:val="ListBullet"/>
+      </w:pPr>
+      <w:r>
+        <w:t xml:space="preserve">Limitation: frontend-এ test runner নেই; browser-এ হাতে যাচাই করতে হবে।</w:t>
+      </w:r>
+    </w:p>
+    <w:p>
+      <w:pPr>
+        <w:pStyle w:val="ListBullet"/>
+      </w:pPr>
+      <w:r>
+        <w:t xml:space="preserve">Explain-back: দাম মিলিয়ে দেখানোর পরও backend কেন আবার দাম হিসাব করে?</w:t>
+      </w:r>
+    </w:p>
     <w:sectPr>
       <w:headerReference w:type="default" r:id="rId9"/>
       <w:footerReference w:type="default" r:id="rId10"/>

</xml_diff>

<commit_message>
fix: bound HTTP timeouts, drain on shutdown, and size the DB pool
The server now uses explicit read, write and idle timeouts, stops on
SIGINT/SIGTERM with a 15-second drain, and closes the database pool only
after requests finish. Pool size and ping time are bounded.

Co-Authored-By: Claude Opus 5.5 <noreply@anthropic.com>
</commit_message>
<xml_diff>
--- a/docs/Bongkey_Technical_Learning_Guide.docx
+++ b/docs/Bongkey_Technical_Learning_Guide.docx
@@ -13547,6 +13547,84 @@
         <w:t xml:space="preserve">Explain-back: দাম মিলিয়ে দেখানোর পরও backend কেন আবার দাম হিসাব করে?</w:t>
       </w:r>
     </w:p>
+    <w:p>
+      <w:pPr>
+        <w:pStyle w:val="Heading2"/>
+        <w:keepNext/>
+      </w:pPr>
+      <w:r>
+        <w:t xml:space="preserve">Fix 6: Server timeout ও graceful shutdown</w:t>
+      </w:r>
+    </w:p>
+    <w:p>
+      <w:r>
+        <w:t xml:space="preserve">সমস্যা: Default Gin Run-এ timeout নেই; restart-এ চলমান checkout কেটে যেত; database pool সীমাহীন।</w:t>
+      </w:r>
+    </w:p>
+    <w:p>
+      <w:pPr>
+        <w:pStyle w:val="ListBullet"/>
+      </w:pPr>
+      <w:r>
+        <w:t xml:space="preserve">Concept: Slowloris attack — ধীরে ধীরে header পাঠিয়ে connection আটকে রাখা। ReadHeaderTimeout এটা থামায়।</w:t>
+      </w:r>
+    </w:p>
+    <w:p>
+      <w:pPr>
+        <w:pStyle w:val="ListBullet"/>
+      </w:pPr>
+      <w:r>
+        <w:t xml:space="preserve">Concept: Graceful shutdown — নতুন request বন্ধ, চলমান request শেষ হতে দেওয়া, তারপর dependency (database) বন্ধ।</w:t>
+      </w:r>
+    </w:p>
+    <w:p>
+      <w:pPr>
+        <w:pStyle w:val="ListBullet"/>
+      </w:pPr>
+      <w:r>
+        <w:t xml:space="preserve">Code: serve → signal.NotifyContext → runHTTP → goroutine-এ ListenAndServe → ctx.Done → server.Shutdown(15s)।</w:t>
+      </w:r>
+    </w:p>
+    <w:p>
+      <w:pPr>
+        <w:pStyle w:val="ListBullet"/>
+      </w:pPr>
+      <w:r>
+        <w:t xml:space="preserve">Go শেখা: goroutine-এর owner, stop condition আর error কোথায় যায় — তিনটাই স্পষ্ট। Buffered channel (1) দিয়ে goroutine কখনো আটকে থাকে না।</w:t>
+      </w:r>
+    </w:p>
+    <w:p>
+      <w:pPr>
+        <w:pStyle w:val="ListBullet"/>
+      </w:pPr>
+      <w:r>
+        <w:t xml:space="preserve">Go শেখা: defer উল্টো ক্রমে চলে; database.DB.Close() server থামার পরে চলে।</w:t>
+      </w:r>
+    </w:p>
+    <w:p>
+      <w:pPr>
+        <w:pStyle w:val="ListBullet"/>
+      </w:pPr>
+      <w:r>
+        <w:t xml:space="preserve">Failure: port ব্যস্ত → ListenAndServe সাথে সাথে error → select-এর প্রথম case → log.Fatalf।</w:t>
+      </w:r>
+    </w:p>
+    <w:p>
+      <w:pPr>
+        <w:pStyle w:val="ListBullet"/>
+      </w:pPr>
+      <w:r>
+        <w:t xml:space="preserve">Test: TestRunHTTPDrainsInFlightRequestOnShutdown, race detector সহ পাস।</w:t>
+      </w:r>
+    </w:p>
+    <w:p>
+      <w:pPr>
+        <w:pStyle w:val="ListBullet"/>
+      </w:pPr>
+      <w:r>
+        <w:t xml:space="preserve">Explain-back: Route register করা আর handler চালানো কেন আলাদা জিনিস?</w:t>
+      </w:r>
+    </w:p>
     <w:sectPr>
       <w:headerReference w:type="default" r:id="rId9"/>
       <w:footerReference w:type="default" r:id="rId10"/>

</xml_diff>

<commit_message>
fix: store host-free upload paths and share one image URL helper
Uploads now return /uploads/<folder>/<file> instead of a URL built from the
request Host and an untrusted X-Forwarded-Proto header. The frontend resolves
paths with one assetUrl helper that still accepts older absolute URLs.

Co-Authored-By: Claude Opus 5.5 <noreply@anthropic.com>
</commit_message>
<xml_diff>
--- a/docs/Bongkey_Technical_Learning_Guide.docx
+++ b/docs/Bongkey_Technical_Learning_Guide.docx
@@ -13625,6 +13625,76 @@
         <w:t xml:space="preserve">Explain-back: Route register করা আর handler চালানো কেন আলাদা জিনিস?</w:t>
       </w:r>
     </w:p>
+    <w:p>
+      <w:pPr>
+        <w:pStyle w:val="Heading2"/>
+        <w:keepNext/>
+      </w:pPr>
+      <w:r>
+        <w:t xml:space="preserve">Fix 7: Relative upload URL</w:t>
+      </w:r>
+    </w:p>
+    <w:p>
+      <w:r>
+        <w:t xml:space="preserve">সমস্যা: ছবির URL-এ server-এর host লেখা হয়ে DB-তে সেভ হতো, তাই domain বদলালে সব ছবি ভাঙত।</w:t>
+      </w:r>
+    </w:p>
+    <w:p>
+      <w:pPr>
+        <w:pStyle w:val="ListBullet"/>
+      </w:pPr>
+      <w:r>
+        <w:t xml:space="preserve">Concept: Data-তে environment-নির্ভর মান (host, port) রাখা যায় না; সেটা configuration-এ থাকে (NEXT_PUBLIC_API_URL)।</w:t>
+      </w:r>
+    </w:p>
+    <w:p>
+      <w:pPr>
+        <w:pStyle w:val="ListBullet"/>
+      </w:pPr>
+      <w:r>
+        <w:t xml:space="preserve">Concept: Request header (Host, X-Forwarded-Proto) client বদলাতে পারে; trusted proxy ছাড়া এগুলো বিশ্বাস করা যায় না।</w:t>
+      </w:r>
+    </w:p>
+    <w:p>
+      <w:pPr>
+        <w:pStyle w:val="ListBullet"/>
+      </w:pPr>
+      <w:r>
+        <w:t xml:space="preserve">Code: uploadImage → "/uploads/" + folder + "/" + filename; frontend assetUrl() API_URL যোগ করে।</w:t>
+      </w:r>
+    </w:p>
+    <w:p>
+      <w:pPr>
+        <w:pStyle w:val="ListBullet"/>
+      </w:pPr>
+      <w:r>
+        <w:t xml:space="preserve">Lean: একই কাজের তিনটি function একটিতে আনা হয়েছে; এক জায়গায় বদলালেই সব জায়গায় ঠিক।</w:t>
+      </w:r>
+    </w:p>
+    <w:p>
+      <w:pPr>
+        <w:pStyle w:val="ListBullet"/>
+      </w:pPr>
+      <w:r>
+        <w:t xml:space="preserve">Failure: magic-byte check ভুয়া image আটকায় → 400।</w:t>
+      </w:r>
+    </w:p>
+    <w:p>
+      <w:pPr>
+        <w:pStyle w:val="ListBullet"/>
+      </w:pPr>
+      <w:r>
+        <w:t xml:space="preserve">Test: TestProductImageUploadReturnsHostFreePath।</w:t>
+      </w:r>
+    </w:p>
+    <w:p>
+      <w:pPr>
+        <w:pStyle w:val="ListBullet"/>
+      </w:pPr>
+      <w:r>
+        <w:t xml:space="preserve">Explain-back: file extension check আর magic-byte check-এর পার্থক্য কী?</w:t>
+      </w:r>
+    </w:p>
     <w:sectPr>
       <w:headerReference w:type="default" r:id="rId9"/>
       <w:footerReference w:type="default" r:id="rId10"/>

</xml_diff>

<commit_message>
fix: stop accepting an unvalidated prescription URL at checkout
The checkout request no longer binds or stores prescription_file_url. The
idempotency fingerprint keeps the old empty field so retries of accepted
orders still match. The column stays to avoid a destructive migration.

Co-Authored-By: Claude Opus 5.5 <noreply@anthropic.com>
</commit_message>
<xml_diff>
--- a/docs/Bongkey_Technical_Learning_Guide.docx
+++ b/docs/Bongkey_Technical_Learning_Guide.docx
@@ -13695,6 +13695,60 @@
         <w:t xml:space="preserve">Explain-back: file extension check আর magic-byte check-এর পার্থক্য কী?</w:t>
       </w:r>
     </w:p>
+    <w:p>
+      <w:pPr>
+        <w:pStyle w:val="Heading2"/>
+        <w:keepNext/>
+      </w:pPr>
+      <w:r>
+        <w:t xml:space="preserve">Fix 8: যাচাইহীন prescription field সরানো</w:t>
+      </w:r>
+    </w:p>
+    <w:p>
+      <w:r>
+        <w:t xml:space="preserve">সমস্যা: Client যেকোনো text prescription URL হিসেবে পাঠাতে পারত, যা পরে admin-কে বিপজ্জনক link-এ নিয়ে যেতে পারত।</w:t>
+      </w:r>
+    </w:p>
+    <w:p>
+      <w:pPr>
+        <w:pStyle w:val="ListBullet"/>
+      </w:pPr>
+      <w:r>
+        <w:t xml:space="preserve">Concept: Trust boundary-তে যে input ব্যবহার হয় না, সেটা না নেওয়াই সবচেয়ে নিরাপদ validation।</w:t>
+      </w:r>
+    </w:p>
+    <w:p>
+      <w:pPr>
+        <w:pStyle w:val="ListBullet"/>
+      </w:pPr>
+      <w:r>
+        <w:t xml:space="preserve">Concept: Backward compatibility — idempotency fingerprint বদলালে আগের order-এর retry conflict পেত, তাই fingerprint-এর আকার অপরিবর্তিত।</w:t>
+      </w:r>
+    </w:p>
+    <w:p>
+      <w:pPr>
+        <w:pStyle w:val="ListBullet"/>
+      </w:pPr>
+      <w:r>
+        <w:t xml:space="preserve">Concept: Destructive migration এড়ানো — column মুছে না ফেলে শুধু লেখা বন্ধ।</w:t>
+      </w:r>
+    </w:p>
+    <w:p>
+      <w:pPr>
+        <w:pStyle w:val="ListBullet"/>
+      </w:pPr>
+      <w:r>
+        <w:t xml:space="preserve">Test: TestCheckoutRequestHashMatchesPrePrescriptionRemoval এবং আসল PostgreSQL checkout integration test।</w:t>
+      </w:r>
+    </w:p>
+    <w:p>
+      <w:pPr>
+        <w:pStyle w:val="ListBullet"/>
+      </w:pPr>
+      <w:r>
+        <w:t xml:space="preserve">Explain-back: column drop করা কেন code rollback-কে কঠিন করে?</w:t>
+      </w:r>
+    </w:p>
     <w:sectPr>
       <w:headerReference w:type="default" r:id="rId9"/>
       <w:footerReference w:type="default" r:id="rId10"/>

</xml_diff>

<commit_message>
refactor: delete the unused hardcoded demo catalog
No file imported the demo products array or its helpers; only the Product
type and formatPrice remain. All products now come from the API.

Co-Authored-By: Claude Opus 5.5 <noreply@anthropic.com>
</commit_message>
<xml_diff>
--- a/docs/Bongkey_Technical_Learning_Guide.docx
+++ b/docs/Bongkey_Technical_Learning_Guide.docx
@@ -13749,6 +13749,39 @@
         <w:t xml:space="preserve">Explain-back: column drop করা কেন code rollback-কে কঠিন করে?</w:t>
       </w:r>
     </w:p>
+    <w:p>
+      <w:pPr>
+        <w:pStyle w:val="Heading2"/>
+        <w:keepNext/>
+      </w:pPr>
+      <w:r>
+        <w:t xml:space="preserve">Fix 9: Dead demo data মোছা</w:t>
+      </w:r>
+    </w:p>
+    <w:p>
+      <w:pPr>
+        <w:pStyle w:val="ListBullet"/>
+      </w:pPr>
+      <w:r>
+        <w:t xml:space="preserve">Concept: Dead code শুধু জায়গা নেয় না, ভুল ব্যবহারের ঝুঁকিও রাখে। এখানে নকল product আসল দোকানে দেখানোর পথ খোলা ছিল।</w:t>
+      </w:r>
+    </w:p>
+    <w:p>
+      <w:pPr>
+        <w:pStyle w:val="ListBullet"/>
+      </w:pPr>
+      <w:r>
+        <w:t xml:space="preserve">পদ্ধতি: মোছার আগে পুরো repo grep করে নিশ্চিত হওয়া যে কেউ import করে না; তারপর type-check ও build দিয়ে প্রমাণ।</w:t>
+      </w:r>
+    </w:p>
+    <w:p>
+      <w:pPr>
+        <w:pStyle w:val="ListBullet"/>
+      </w:pPr>
+      <w:r>
+        <w:t xml:space="preserve">Explain-back: কোনো code "unused" বলার আগে কোন কোন জায়গায় খুঁজতে হয়?</w:t>
+      </w:r>
+    </w:p>
     <w:sectPr>
       <w:headerReference w:type="default" r:id="rId9"/>
       <w:footerReference w:type="default" r:id="rId10"/>

</xml_diff>

<commit_message>
fix: page the admin order list with a keyset cursor
GET /api/admin/orders returns at most 50 orders and accepts ?before=<id>
for older pages; invalid cursors get 400. The admin page adds a
"Load older orders" button.

Co-Authored-By: Claude Opus 5.5 <noreply@anthropic.com>
</commit_message>
<xml_diff>
--- a/docs/Bongkey_Technical_Learning_Guide.docx
+++ b/docs/Bongkey_Technical_Learning_Guide.docx
@@ -13782,6 +13782,60 @@
         <w:t xml:space="preserve">Explain-back: কোনো code "unused" বলার আগে কোন কোন জায়গায় খুঁজতে হয়?</w:t>
       </w:r>
     </w:p>
+    <w:p>
+      <w:pPr>
+        <w:pStyle w:val="Heading2"/>
+        <w:keepNext/>
+      </w:pPr>
+      <w:r>
+        <w:t xml:space="preserve">Fix 10: Keyset pagination</w:t>
+      </w:r>
+    </w:p>
+    <w:p>
+      <w:r>
+        <w:t xml:space="preserve">সমস্যা: Admin order list সীমাহীন ছিল, order বাড়লে ধীর হতো।</w:t>
+      </w:r>
+    </w:p>
+    <w:p>
+      <w:pPr>
+        <w:pStyle w:val="ListBullet"/>
+      </w:pPr>
+      <w:r>
+        <w:t xml:space="preserve">Concept: OFFSET pagination নতুন row এলে সরে যায়; keyset ("id &lt; শেষ id") স্থির এবং index-বান্ধব।</w:t>
+      </w:r>
+    </w:p>
+    <w:p>
+      <w:pPr>
+        <w:pStyle w:val="ListBullet"/>
+      </w:pPr>
+      <w:r>
+        <w:t xml:space="preserve">Code: ListOrders (?before parse) → ListAdmin(ctx, beforeID) → LIMIT 50।</w:t>
+      </w:r>
+    </w:p>
+    <w:p>
+      <w:pPr>
+        <w:pStyle w:val="ListBullet"/>
+      </w:pPr>
+      <w:r>
+        <w:t xml:space="preserve">Failure: অবৈধ cursor → handler-এ 400, database কাজ হয় না — input parse করা handler-এর দায়িত্ব।</w:t>
+      </w:r>
+    </w:p>
+    <w:p>
+      <w:pPr>
+        <w:pStyle w:val="ListBullet"/>
+      </w:pPr>
+      <w:r>
+        <w:t xml:space="preserve">Test: TestListOrdersRejectsInvalidCursor এবং PostgreSQL TestCheckoutOrderPostgres।</w:t>
+      </w:r>
+    </w:p>
+    <w:p>
+      <w:pPr>
+        <w:pStyle w:val="ListBullet"/>
+      </w:pPr>
+      <w:r>
+        <w:t xml:space="preserve">Explain-back: OFFSET দিয়ে page 2 দেখার সময় নতুন order এলে কী হয়?</w:t>
+      </w:r>
+    </w:p>
     <w:sectPr>
       <w:headerReference w:type="default" r:id="rId9"/>
       <w:footerReference w:type="default" r:id="rId10"/>

</xml_diff>

<commit_message>
fix: look up orders by typed key so indexes are used
Find now compares a numeric ID with o.id or anything else with
o.order_number, instead of casting id to text, which forced a table scan.
Non-positive IDs return not found without querying.

Co-Authored-By: Claude Opus 5.5 <noreply@anthropic.com>
</commit_message>
<xml_diff>
--- a/docs/Bongkey_Technical_Learning_Guide.docx
+++ b/docs/Bongkey_Technical_Learning_Guide.docx
@@ -13836,6 +13836,47 @@
         <w:t xml:space="preserve">Explain-back: OFFSET দিয়ে page 2 দেখার সময় নতুন order এলে কী হয়?</w:t>
       </w:r>
     </w:p>
+    <w:p>
+      <w:pPr>
+        <w:pStyle w:val="Heading2"/>
+        <w:keepNext/>
+      </w:pPr>
+      <w:r>
+        <w:t xml:space="preserve">Fix 11: Index-বান্ধব lookup</w:t>
+      </w:r>
+    </w:p>
+    <w:p>
+      <w:pPr>
+        <w:pStyle w:val="ListBullet"/>
+      </w:pPr>
+      <w:r>
+        <w:t xml:space="preserve">Concept: Column-এ function বা cast (id::text) লাগালে সাধারণ index ব্যবহার হয় না; database প্রতিটি row পড়ে।</w:t>
+      </w:r>
+    </w:p>
+    <w:p>
+      <w:pPr>
+        <w:pStyle w:val="ListBullet"/>
+      </w:pPr>
+      <w:r>
+        <w:t xml:space="preserve">Security: query-র দুটি রূপ নির্দিষ্ট constant; user input শুধু $1 parameter হিসেবে যায় — SQL injection-এর সুযোগ নেই।</w:t>
+      </w:r>
+    </w:p>
+    <w:p>
+      <w:pPr>
+        <w:pStyle w:val="ListBullet"/>
+      </w:pPr>
+      <w:r>
+        <w:t xml:space="preserve">Test: PostgreSQL TestCheckoutOrderPostgres (id, order number, "0")।</w:t>
+      </w:r>
+    </w:p>
+    <w:p>
+      <w:pPr>
+        <w:pStyle w:val="ListBullet"/>
+      </w:pPr>
+      <w:r>
+        <w:t xml:space="preserve">Explain-back: EXPLAIN দিয়ে কীভাবে বোঝা যায় query index ব্যবহার করছে কিনা?</w:t>
+      </w:r>
+    </w:p>
     <w:sectPr>
       <w:headerReference w:type="default" r:id="rId9"/>
       <w:footerReference w:type="default" r:id="rId10"/>

</xml_diff>

<commit_message>
fix: lock products in ID order when cancelling to avoid deadlocks
RestoreStock now locks the order's product rows in ascending ID order,
matching checkout, before restoring stock.

Co-Authored-By: Claude Opus 5.5 <noreply@anthropic.com>
</commit_message>
<xml_diff>
--- a/docs/Bongkey_Technical_Learning_Guide.docx
+++ b/docs/Bongkey_Technical_Learning_Guide.docx
@@ -13877,6 +13877,55 @@
         <w:t xml:space="preserve">Explain-back: EXPLAIN দিয়ে কীভাবে বোঝা যায় query index ব্যবহার করছে কিনা?</w:t>
       </w:r>
     </w:p>
+    <w:p>
+      <w:pPr>
+        <w:pStyle w:val="Heading2"/>
+        <w:keepNext/>
+      </w:pPr>
+      <w:r>
+        <w:t xml:space="preserve">Fix 12: Lock ordering</w:t>
+      </w:r>
+    </w:p>
+    <w:p>
+      <w:pPr>
+        <w:pStyle w:val="ListBullet"/>
+      </w:pPr>
+      <w:r>
+        <w:t xml:space="preserve">Concept: Deadlock হয় যখন দুই transaction বিপরীত ক্রমে দুটি row lock করে, আর প্রত্যেকে অন্যটির জন্য অপেক্ষা করে।</w:t>
+      </w:r>
+    </w:p>
+    <w:p>
+      <w:pPr>
+        <w:pStyle w:val="ListBullet"/>
+      </w:pPr>
+      <w:r>
+        <w:t xml:space="preserve">নিয়ম: সব code path-এ একই ক্রমে lock (এখানে product id ছোট থেকে বড়)।</w:t>
+      </w:r>
+    </w:p>
+    <w:p>
+      <w:pPr>
+        <w:pStyle w:val="ListBullet"/>
+      </w:pPr>
+      <w:r>
+        <w:t xml:space="preserve">Code: RestoreStock প্রথমে SELECT ... ORDER BY id FOR UPDATE, তারপর UPDATE।</w:t>
+      </w:r>
+    </w:p>
+    <w:p>
+      <w:pPr>
+        <w:pStyle w:val="ListBullet"/>
+      </w:pPr>
+      <w:r>
+        <w:t xml:space="preserve">Limitation: deadlock timing-নির্ভর, তাই নির্ভরযোগ্য automated test নেই; বিদ্যমান PostgreSQL cancel test পাস।</w:t>
+      </w:r>
+    </w:p>
+    <w:p>
+      <w:pPr>
+        <w:pStyle w:val="ListBullet"/>
+      </w:pPr>
+      <w:r>
+        <w:t xml:space="preserve">Explain-back: checkout কোথায় lock order ঠিক করে, আর cancel এখন কোথায় করে?</w:t>
+      </w:r>
+    </w:p>
     <w:sectPr>
       <w:headerReference w:type="default" r:id="rId9"/>
       <w:footerReference w:type="default" r:id="rId10"/>

</xml_diff>

<commit_message>
refactor: keep one Slugify in catalog for seeds and admin edits
The database seed code now calls catalog.Slugify instead of its own copy.

Co-Authored-By: Claude Opus 5.5 <noreply@anthropic.com>
</commit_message>
<xml_diff>
--- a/docs/Bongkey_Technical_Learning_Guide.docx
+++ b/docs/Bongkey_Technical_Learning_Guide.docx
@@ -13926,6 +13926,39 @@
         <w:t xml:space="preserve">Explain-back: checkout কোথায় lock order ঠিক করে, আর cancel এখন কোথায় করে?</w:t>
       </w:r>
     </w:p>
+    <w:p>
+      <w:pPr>
+        <w:pStyle w:val="Heading2"/>
+        <w:keepNext/>
+      </w:pPr>
+      <w:r>
+        <w:t xml:space="preserve">Fix 13: Duplicate function একত্র করা</w:t>
+      </w:r>
+    </w:p>
+    <w:p>
+      <w:pPr>
+        <w:pStyle w:val="ListBullet"/>
+      </w:pPr>
+      <w:r>
+        <w:t xml:space="preserve">Concept: একই নিয়ম দুই জায়গায় থাকলে একদিন তারা আলাদা হয়ে যায়। নিয়মটির মালিক একটি package (catalog)।</w:t>
+      </w:r>
+    </w:p>
+    <w:p>
+      <w:pPr>
+        <w:pStyle w:val="ListBullet"/>
+      </w:pPr>
+      <w:r>
+        <w:t xml:space="preserve">Go শেখা: বড় হাতের অক্ষরে শুরু (Slugify) মানে exported; অন্য package ব্যবহার করতে পারে। Import cycle হলে Go compile হয় না।</w:t>
+      </w:r>
+    </w:p>
+    <w:p>
+      <w:pPr>
+        <w:pStyle w:val="ListBullet"/>
+      </w:pPr>
+      <w:r>
+        <w:t xml:space="preserve">Explain-back: database package কেন catalog-কে import করতে পারে, কিন্তু উল্টোটা কেন উচিত নয়?</w:t>
+      </w:r>
+    </w:p>
     <w:sectPr>
       <w:headerReference w:type="default" r:id="rId9"/>
       <w:footerReference w:type="default" r:id="rId10"/>

</xml_diff>

<commit_message>
refactor: remove dead order-token helper, placeholder model and stale doc
NewOrderToken was only used by tests, which now use IdempotentOrderToken;
its negative checks moved into the remaining token test. The empty models
placeholder and the outdated FOUNDATION.md are deleted, and the workflow doc
references are corrected.

Co-Authored-By: Claude Opus 5.5 <noreply@anthropic.com>
</commit_message>
<xml_diff>
--- a/docs/Bongkey_Technical_Learning_Guide.docx
+++ b/docs/Bongkey_Technical_Learning_Guide.docx
@@ -13959,6 +13959,39 @@
         <w:t xml:space="preserve">Explain-back: database package কেন catalog-কে import করতে পারে, কিন্তু উল্টোটা কেন উচিত নয়?</w:t>
       </w:r>
     </w:p>
+    <w:p>
+      <w:pPr>
+        <w:pStyle w:val="Heading2"/>
+        <w:keepNext/>
+      </w:pPr>
+      <w:r>
+        <w:t xml:space="preserve">Fix 14: Dead code ও stale doc</w:t>
+      </w:r>
+    </w:p>
+    <w:p>
+      <w:pPr>
+        <w:pStyle w:val="ListBullet"/>
+      </w:pPr>
+      <w:r>
+        <w:t xml:space="preserve">Concept: শুধু test-এ ব্যবহার হওয়া production function আসলে dead code; test-কে বাস্তব code path (IdempotentOrderToken) দিয়ে চালানোই ভালো।</w:t>
+      </w:r>
+    </w:p>
+    <w:p>
+      <w:pPr>
+        <w:pStyle w:val="ListBullet"/>
+      </w:pPr>
+      <w:r>
+        <w:t xml:space="preserve">Concept: ভুল documentation code-এর চেয়েও ক্ষতিকর, কারণ মানুষ তা বিশ্বাস করে।</w:t>
+      </w:r>
+    </w:p>
+    <w:p>
+      <w:pPr>
+        <w:pStyle w:val="ListBullet"/>
+      </w:pPr>
+      <w:r>
+        <w:t xml:space="preserve">Explain-back: কোনো function মুছলে কোন কোন test-এর negative check হারিয়ে যেতে পারে, আর সেগুলো কোথায় রাখলে?</w:t>
+      </w:r>
+    </w:p>
     <w:sectPr>
       <w:headerReference w:type="default" r:id="rId9"/>
       <w:footerReference w:type="default" r:id="rId10"/>

</xml_diff>

<commit_message>
docs: record S0 PostgreSQL verification after owner-run migrations
Co-Authored-By: Claude Opus 5.5 <noreply@anthropic.com>
</commit_message>
<xml_diff>
--- a/docs/Bongkey_Technical_Learning_Guide.docx
+++ b/docs/Bongkey_Technical_Learning_Guide.docx
@@ -14046,6 +14046,14 @@
         <w:t xml:space="preserve">Explain-back: git conflict marker (&lt;&lt;&lt;&lt;&lt;&lt;&lt; ======= &gt;&gt;&gt;&gt;&gt;&gt;&gt;)-এর তিনটি অংশ কী বোঝায়?</w:t>
       </w:r>
     </w:p>
+    <w:p>
+      <w:pPr>
+        <w:pStyle w:val="ListBullet"/>
+      </w:pPr>
+      <w:r>
+        <w:t xml:space="preserve">S0 যাচাই: owner backend চালিয়ে migration 009 ও 010 লাগিয়েছেন, graceful shutdown দেখেছেন; তারপর সব PostgreSQL integration test পাস।</w:t>
+      </w:r>
+    </w:p>
     <w:sectPr>
       <w:headerReference w:type="default" r:id="rId9"/>
       <w:footerReference w:type="default" r:id="rId10"/>

</xml_diff>